<commit_message>
Deployed c052ed4 with MkDocs version: 1.6.1
</commit_message>
<xml_diff>
--- a/tema2/plantillas/Actividad_2_3_INU_Plantilla.docx
+++ b/tema2/plantillas/Actividad_2_3_INU_Plantilla.docx
@@ -167,7 +167,7 @@
                 <w:sz w:val="20"/>
                 <w:szCs w:val="20"/>
               </w:rPr>
-              <w:t xml:space="preserve">Identificador de recursos usado (ej. turnos-app-&lt;tu-identificador&gt;): _______________________</w:t>
+              <w:t xml:space="preserve">Identificador de recursos usado (ej. pistas-panel-&lt;tu-identificador&gt;): _______________________</w:t>
             </w:r>
           </w:p>
         </w:tc>
@@ -222,7 +222,7 @@
           <w:sz w:val="24"/>
           <w:szCs w:val="24"/>
         </w:rPr>
-        <w:t xml:space="preserve">Paso 1 — Despliega la app de turnos con user data, solo en los puertos necesarios</w:t>
+        <w:t xml:space="preserve">Paso 1 — Despliega el panel de reservas con user data, solo en los puertos necesarios</w:t>
       </w:r>
     </w:p>
     <w:tbl>
@@ -268,7 +268,7 @@
                 <w:sz w:val="20"/>
                 <w:szCs w:val="20"/>
               </w:rPr>
-              <w:t xml:space="preserve">📸 La app de turnos funcionando en el navegador</w:t>
+              <w:t xml:space="preserve">📸 Tu panel de reservas funcionando en el navegador</w:t>
             </w:r>
           </w:p>
         </w:tc>
@@ -478,7 +478,7 @@
                 <w:sz w:val="20"/>
                 <w:szCs w:val="20"/>
               </w:rPr>
-              <w:t xml:space="preserve">📸 La AMI propia en estado available, con su nombre y tamaño</w:t>
+              <w:t xml:space="preserve">📸 La AMI propia en estado available, con su nombre y su ID de AMI</w:t>
             </w:r>
           </w:p>
         </w:tc>
@@ -532,29 +532,6 @@
       <w:r>
         <w:br w:type="page"/>
       </w:r>
-    </w:p>
-    <w:p>
-      <w:pPr>
-        <w:shd w:fill="3949AB" w:val="clear"/>
-        <w:spacing w:after="0" w:before="320"/>
-        <w:ind w:left="200" w:right="200"/>
-      </w:pPr>
-      <w:r>
-        <w:rPr>
-          <w:rFonts w:ascii="Arial" w:cs="Arial" w:eastAsia="Arial" w:hAnsi="Arial"/>
-          <w:b/>
-          <w:bCs/>
-          <w:color w:val="FFFFFF"/>
-          <w:sz w:val="26"/>
-          <w:szCs w:val="26"/>
-        </w:rPr>
-        <w:t xml:space="preserve">Parte B — Reto: plantilla de lanzamiento y comparación de coste</w:t>
-      </w:r>
-    </w:p>
-    <w:p>
-      <w:pPr>
-        <w:spacing w:after="120"/>
-      </w:pPr>
     </w:p>
     <w:p>
       <w:pPr>
@@ -572,21 +549,7 @@
           <w:sz w:val="24"/>
           <w:szCs w:val="24"/>
         </w:rPr>
-        <w:t xml:space="preserve">Predicción: tiempo de arranque con imagen propia</w:t>
-      </w:r>
-    </w:p>
-    <w:p>
-      <w:pPr>
-        <w:spacing w:after="100"/>
-      </w:pPr>
-      <w:r>
-        <w:rPr>
-          <w:rFonts w:ascii="Arial" w:cs="Arial" w:eastAsia="Arial" w:hAnsi="Arial"/>
-          <w:color w:val="212121"/>
-          <w:sz w:val="22"/>
-          <w:szCs w:val="22"/>
-        </w:rPr>
-        <w:t xml:space="preserve">Antes de construir la plantilla: si empaquetas tu propia AMI y arrancas una instancia desde ella, ¿cuánto crees que va a tardar en estar respondiendo, comparado con el tiempo de la Actividad 2.2 (que instalaba el servidor desde cero vía user data sobre una imagen genérica)? Escribe tu predicción y por qué crees eso.</w:t>
+        <w:t xml:space="preserve">Paso 3 — Empaqueta tu AMI en una plantilla de lanzamiento</w:t>
       </w:r>
     </w:p>
     <w:tbl>
@@ -605,8 +568,41 @@
         <w:gridCol w:w="9638"/>
       </w:tblGrid>
       <w:tr>
+        <w:tc>
+          <w:tcPr>
+            <w:tcW w:type="dxa" w:w="9638"/>
+            <w:tcBorders>
+              <w:top w:val="none" w:color="FFFFFF" w:sz="0"/>
+              <w:left w:val="none" w:color="FFFFFF" w:sz="0"/>
+              <w:bottom w:val="none" w:color="FFFFFF" w:sz="0"/>
+              <w:right w:val="none" w:color="FFFFFF" w:sz="0"/>
+            </w:tcBorders>
+            <w:shd w:fill="3949AB" w:val="clear"/>
+            <w:tcMar>
+              <w:top w:type="dxa" w:w="80"/>
+              <w:left w:type="dxa" w:w="160"/>
+              <w:bottom w:type="dxa" w:w="80"/>
+              <w:right w:type="dxa" w:w="160"/>
+            </w:tcMar>
+          </w:tcPr>
+          <w:p>
+            <w:r>
+              <w:rPr>
+                <w:rFonts w:ascii="Arial" w:cs="Arial" w:eastAsia="Arial" w:hAnsi="Arial"/>
+                <w:b/>
+                <w:bCs/>
+                <w:color w:val="FFFFFF"/>
+                <w:sz w:val="20"/>
+                <w:szCs w:val="20"/>
+              </w:rPr>
+              <w:t xml:space="preserve">📸 Resumen de tu plantilla de lanzamiento, con la AMI propia y el resto de parámetros visibles</w:t>
+            </w:r>
+          </w:p>
+        </w:tc>
+      </w:tr>
+      <w:tr>
         <w:trPr>
-          <w:trHeight w:val="480"/>
+          <w:trHeight w:val="2400"/>
         </w:trPr>
         <w:tc>
           <w:tcPr>
@@ -619,115 +615,26 @@
             </w:tcBorders>
             <w:shd w:fill="FAFAFA" w:val="clear"/>
             <w:tcMar>
-              <w:top w:type="dxa" w:w="60"/>
+              <w:top w:type="dxa" w:w="80"/>
               <w:left w:type="dxa" w:w="160"/>
-              <w:bottom w:type="dxa" w:w="60"/>
+              <w:bottom w:type="dxa" w:w="80"/>
               <w:right w:type="dxa" w:w="160"/>
             </w:tcMar>
           </w:tcPr>
           <w:p>
-            <w:r>
-              <w:rPr>
-                <w:sz w:val="22"/>
-                <w:szCs w:val="22"/>
-              </w:rPr>
-              <w:t xml:space="preserve"/>
-            </w:r>
-          </w:p>
-        </w:tc>
-      </w:tr>
-      <w:tr>
-        <w:trPr>
-          <w:trHeight w:val="480"/>
-        </w:trPr>
-        <w:tc>
-          <w:tcPr>
-            <w:tcW w:type="dxa" w:w="9638"/>
-            <w:tcBorders>
-              <w:top w:val="single" w:color="E0E0E0" w:sz="4"/>
-              <w:left w:val="single" w:color="E0E0E0" w:sz="4"/>
-              <w:bottom w:val="single" w:color="E0E0E0" w:sz="4"/>
-              <w:right w:val="single" w:color="E0E0E0" w:sz="4"/>
-            </w:tcBorders>
-            <w:shd w:fill="FAFAFA" w:val="clear"/>
-            <w:tcMar>
-              <w:top w:type="dxa" w:w="60"/>
-              <w:left w:type="dxa" w:w="160"/>
-              <w:bottom w:type="dxa" w:w="60"/>
-              <w:right w:type="dxa" w:w="160"/>
-            </w:tcMar>
-          </w:tcPr>
-          <w:p>
-            <w:r>
-              <w:rPr>
-                <w:sz w:val="22"/>
-                <w:szCs w:val="22"/>
-              </w:rPr>
-              <w:t xml:space="preserve"/>
-            </w:r>
-          </w:p>
-        </w:tc>
-      </w:tr>
-      <w:tr>
-        <w:trPr>
-          <w:trHeight w:val="480"/>
-        </w:trPr>
-        <w:tc>
-          <w:tcPr>
-            <w:tcW w:type="dxa" w:w="9638"/>
-            <w:tcBorders>
-              <w:top w:val="single" w:color="E0E0E0" w:sz="4"/>
-              <w:left w:val="single" w:color="E0E0E0" w:sz="4"/>
-              <w:bottom w:val="single" w:color="E0E0E0" w:sz="4"/>
-              <w:right w:val="single" w:color="E0E0E0" w:sz="4"/>
-            </w:tcBorders>
-            <w:shd w:fill="FAFAFA" w:val="clear"/>
-            <w:tcMar>
-              <w:top w:type="dxa" w:w="60"/>
-              <w:left w:type="dxa" w:w="160"/>
-              <w:bottom w:type="dxa" w:w="60"/>
-              <w:right w:type="dxa" w:w="160"/>
-            </w:tcMar>
-          </w:tcPr>
-          <w:p>
-            <w:r>
-              <w:rPr>
-                <w:sz w:val="22"/>
-                <w:szCs w:val="22"/>
-              </w:rPr>
-              <w:t xml:space="preserve"/>
-            </w:r>
-          </w:p>
-        </w:tc>
-      </w:tr>
-      <w:tr>
-        <w:trPr>
-          <w:trHeight w:val="480"/>
-        </w:trPr>
-        <w:tc>
-          <w:tcPr>
-            <w:tcW w:type="dxa" w:w="9638"/>
-            <w:tcBorders>
-              <w:top w:val="single" w:color="E0E0E0" w:sz="4"/>
-              <w:left w:val="single" w:color="E0E0E0" w:sz="4"/>
-              <w:bottom w:val="single" w:color="E0E0E0" w:sz="4"/>
-              <w:right w:val="single" w:color="E0E0E0" w:sz="4"/>
-            </w:tcBorders>
-            <w:shd w:fill="FAFAFA" w:val="clear"/>
-            <w:tcMar>
-              <w:top w:type="dxa" w:w="60"/>
-              <w:left w:type="dxa" w:w="160"/>
-              <w:bottom w:type="dxa" w:w="60"/>
-              <w:right w:type="dxa" w:w="160"/>
-            </w:tcMar>
-          </w:tcPr>
-          <w:p>
-            <w:r>
-              <w:rPr>
-                <w:sz w:val="22"/>
-                <w:szCs w:val="22"/>
-              </w:rPr>
-              <w:t xml:space="preserve"/>
+            <w:pPr>
+              <w:jc w:val="center"/>
+            </w:pPr>
+            <w:r>
+              <w:rPr>
+                <w:rFonts w:ascii="Arial" w:cs="Arial" w:eastAsia="Arial" w:hAnsi="Arial"/>
+                <w:i/>
+                <w:iCs/>
+                <w:color w:val="757575"/>
+                <w:sz w:val="20"/>
+                <w:szCs w:val="20"/>
+              </w:rPr>
+              <w:t xml:space="preserve">[Pega aquí la captura de pantalla]</w:t>
             </w:r>
           </w:p>
         </w:tc>
@@ -735,8 +642,13 @@
     </w:tbl>
     <w:p>
       <w:pPr>
-        <w:spacing w:after="160"/>
-      </w:pPr>
+        <w:spacing w:after="200"/>
+      </w:pPr>
+    </w:p>
+    <w:p>
+      <w:r>
+        <w:br w:type="page"/>
+      </w:r>
     </w:p>
     <w:p>
       <w:pPr>
@@ -754,7 +666,7 @@
           <w:sz w:val="24"/>
           <w:szCs w:val="24"/>
         </w:rPr>
-        <w:t xml:space="preserve">Cronómetro real de arranque</w:t>
+        <w:t xml:space="preserve">Paso 4 — Lanza instancias idénticas desde tu plantilla</w:t>
       </w:r>
     </w:p>
     <w:p>
@@ -768,7 +680,7 @@
           <w:sz w:val="22"/>
           <w:szCs w:val="22"/>
         </w:rPr>
-        <w:t xml:space="preserve">Plantilla de lanzamiento parametrizada con tu propia imagen, dos instancias idénticas lanzadas desde ella, y el tiempo de arranque cronometrado de verdad.</w:t>
+        <w:t xml:space="preserve">Antes de lanzar: si arrancas una instancia desde tu plantilla —con tu propia AMI ya lista, sin user data que instalar—, ¿cuánto crees que va a tardar en estar respondiendo, comparado con el tiempo del Paso 1? Escribe tu predicción y por qué crees eso.</w:t>
       </w:r>
     </w:p>
     <w:tbl>
@@ -787,6 +699,155 @@
         <w:gridCol w:w="9638"/>
       </w:tblGrid>
       <w:tr>
+        <w:trPr>
+          <w:trHeight w:val="480"/>
+        </w:trPr>
+        <w:tc>
+          <w:tcPr>
+            <w:tcW w:type="dxa" w:w="9638"/>
+            <w:tcBorders>
+              <w:top w:val="single" w:color="E0E0E0" w:sz="4"/>
+              <w:left w:val="single" w:color="E0E0E0" w:sz="4"/>
+              <w:bottom w:val="single" w:color="E0E0E0" w:sz="4"/>
+              <w:right w:val="single" w:color="E0E0E0" w:sz="4"/>
+            </w:tcBorders>
+            <w:shd w:fill="FAFAFA" w:val="clear"/>
+            <w:tcMar>
+              <w:top w:type="dxa" w:w="60"/>
+              <w:left w:type="dxa" w:w="160"/>
+              <w:bottom w:type="dxa" w:w="60"/>
+              <w:right w:type="dxa" w:w="160"/>
+            </w:tcMar>
+          </w:tcPr>
+          <w:p>
+            <w:r>
+              <w:rPr>
+                <w:sz w:val="22"/>
+                <w:szCs w:val="22"/>
+              </w:rPr>
+              <w:t xml:space="preserve"/>
+            </w:r>
+          </w:p>
+        </w:tc>
+      </w:tr>
+      <w:tr>
+        <w:trPr>
+          <w:trHeight w:val="480"/>
+        </w:trPr>
+        <w:tc>
+          <w:tcPr>
+            <w:tcW w:type="dxa" w:w="9638"/>
+            <w:tcBorders>
+              <w:top w:val="single" w:color="E0E0E0" w:sz="4"/>
+              <w:left w:val="single" w:color="E0E0E0" w:sz="4"/>
+              <w:bottom w:val="single" w:color="E0E0E0" w:sz="4"/>
+              <w:right w:val="single" w:color="E0E0E0" w:sz="4"/>
+            </w:tcBorders>
+            <w:shd w:fill="FAFAFA" w:val="clear"/>
+            <w:tcMar>
+              <w:top w:type="dxa" w:w="60"/>
+              <w:left w:type="dxa" w:w="160"/>
+              <w:bottom w:type="dxa" w:w="60"/>
+              <w:right w:type="dxa" w:w="160"/>
+            </w:tcMar>
+          </w:tcPr>
+          <w:p>
+            <w:r>
+              <w:rPr>
+                <w:sz w:val="22"/>
+                <w:szCs w:val="22"/>
+              </w:rPr>
+              <w:t xml:space="preserve"/>
+            </w:r>
+          </w:p>
+        </w:tc>
+      </w:tr>
+      <w:tr>
+        <w:trPr>
+          <w:trHeight w:val="480"/>
+        </w:trPr>
+        <w:tc>
+          <w:tcPr>
+            <w:tcW w:type="dxa" w:w="9638"/>
+            <w:tcBorders>
+              <w:top w:val="single" w:color="E0E0E0" w:sz="4"/>
+              <w:left w:val="single" w:color="E0E0E0" w:sz="4"/>
+              <w:bottom w:val="single" w:color="E0E0E0" w:sz="4"/>
+              <w:right w:val="single" w:color="E0E0E0" w:sz="4"/>
+            </w:tcBorders>
+            <w:shd w:fill="FAFAFA" w:val="clear"/>
+            <w:tcMar>
+              <w:top w:type="dxa" w:w="60"/>
+              <w:left w:type="dxa" w:w="160"/>
+              <w:bottom w:type="dxa" w:w="60"/>
+              <w:right w:type="dxa" w:w="160"/>
+            </w:tcMar>
+          </w:tcPr>
+          <w:p>
+            <w:r>
+              <w:rPr>
+                <w:sz w:val="22"/>
+                <w:szCs w:val="22"/>
+              </w:rPr>
+              <w:t xml:space="preserve"/>
+            </w:r>
+          </w:p>
+        </w:tc>
+      </w:tr>
+      <w:tr>
+        <w:trPr>
+          <w:trHeight w:val="480"/>
+        </w:trPr>
+        <w:tc>
+          <w:tcPr>
+            <w:tcW w:type="dxa" w:w="9638"/>
+            <w:tcBorders>
+              <w:top w:val="single" w:color="E0E0E0" w:sz="4"/>
+              <w:left w:val="single" w:color="E0E0E0" w:sz="4"/>
+              <w:bottom w:val="single" w:color="E0E0E0" w:sz="4"/>
+              <w:right w:val="single" w:color="E0E0E0" w:sz="4"/>
+            </w:tcBorders>
+            <w:shd w:fill="FAFAFA" w:val="clear"/>
+            <w:tcMar>
+              <w:top w:type="dxa" w:w="60"/>
+              <w:left w:type="dxa" w:w="160"/>
+              <w:bottom w:type="dxa" w:w="60"/>
+              <w:right w:type="dxa" w:w="160"/>
+            </w:tcMar>
+          </w:tcPr>
+          <w:p>
+            <w:r>
+              <w:rPr>
+                <w:sz w:val="22"/>
+                <w:szCs w:val="22"/>
+              </w:rPr>
+              <w:t xml:space="preserve"/>
+            </w:r>
+          </w:p>
+        </w:tc>
+      </w:tr>
+    </w:tbl>
+    <w:p>
+      <w:pPr>
+        <w:spacing w:after="120"/>
+      </w:pPr>
+    </w:p>
+    <w:tbl>
+      <w:tblPr>
+        <w:tblW w:type="dxa" w:w="9638"/>
+        <w:tblBorders>
+          <w:top w:val="single" w:color="auto" w:sz="4"/>
+          <w:left w:val="single" w:color="auto" w:sz="4"/>
+          <w:bottom w:val="single" w:color="auto" w:sz="4"/>
+          <w:right w:val="single" w:color="auto" w:sz="4"/>
+          <w:insideH w:val="single" w:color="auto" w:sz="4"/>
+          <w:insideV w:val="single" w:color="auto" w:sz="4"/>
+        </w:tblBorders>
+      </w:tblPr>
+      <w:tblGrid>
+        <w:gridCol w:w="9638"/>
+      </w:tblGrid>
+      <w:tr>
         <w:tc>
           <w:tcPr>
             <w:tcW w:type="dxa" w:w="9638"/>
@@ -814,7 +875,254 @@
                 <w:sz w:val="20"/>
                 <w:szCs w:val="20"/>
               </w:rPr>
-              <w:t xml:space="preserve">📸 Cronómetro real de arranque de las dos instancias</w:t>
+              <w:t xml:space="preserve">📸 Las dos instancias respondiendo en el navegador, y el cronómetro real de arranque</w:t>
+            </w:r>
+          </w:p>
+        </w:tc>
+      </w:tr>
+      <w:tr>
+        <w:trPr>
+          <w:trHeight w:val="2400"/>
+        </w:trPr>
+        <w:tc>
+          <w:tcPr>
+            <w:tcW w:type="dxa" w:w="9638"/>
+            <w:tcBorders>
+              <w:top w:val="single" w:color="E0E0E0" w:sz="4"/>
+              <w:left w:val="single" w:color="E0E0E0" w:sz="4"/>
+              <w:bottom w:val="single" w:color="E0E0E0" w:sz="4"/>
+              <w:right w:val="single" w:color="E0E0E0" w:sz="4"/>
+            </w:tcBorders>
+            <w:shd w:fill="FAFAFA" w:val="clear"/>
+            <w:tcMar>
+              <w:top w:type="dxa" w:w="80"/>
+              <w:left w:type="dxa" w:w="160"/>
+              <w:bottom w:type="dxa" w:w="80"/>
+              <w:right w:type="dxa" w:w="160"/>
+            </w:tcMar>
+          </w:tcPr>
+          <w:p>
+            <w:pPr>
+              <w:jc w:val="center"/>
+            </w:pPr>
+            <w:r>
+              <w:rPr>
+                <w:rFonts w:ascii="Arial" w:cs="Arial" w:eastAsia="Arial" w:hAnsi="Arial"/>
+                <w:i/>
+                <w:iCs/>
+                <w:color w:val="757575"/>
+                <w:sz w:val="20"/>
+                <w:szCs w:val="20"/>
+              </w:rPr>
+              <w:t xml:space="preserve">[Pega aquí la captura de pantalla]</w:t>
+            </w:r>
+          </w:p>
+        </w:tc>
+      </w:tr>
+    </w:tbl>
+    <w:p>
+      <w:pPr>
+        <w:spacing w:after="200"/>
+      </w:pPr>
+    </w:p>
+    <w:p>
+      <w:r>
+        <w:br w:type="page"/>
+      </w:r>
+    </w:p>
+    <w:p>
+      <w:pPr>
+        <w:shd w:fill="3949AB" w:val="clear"/>
+        <w:spacing w:after="0" w:before="320"/>
+        <w:ind w:left="200" w:right="200"/>
+      </w:pPr>
+      <w:r>
+        <w:rPr>
+          <w:rFonts w:ascii="Arial" w:cs="Arial" w:eastAsia="Arial" w:hAnsi="Arial"/>
+          <w:b/>
+          <w:bCs/>
+          <w:color w:val="FFFFFF"/>
+          <w:sz w:val="26"/>
+          <w:szCs w:val="26"/>
+        </w:rPr>
+        <w:t xml:space="preserve">Parte B — Reto: la misma receta, con otra aplicación distinta</w:t>
+      </w:r>
+    </w:p>
+    <w:p>
+      <w:pPr>
+        <w:spacing w:after="120"/>
+      </w:pPr>
+    </w:p>
+    <w:p>
+      <w:pPr>
+        <w:pBdr>
+          <w:bottom w:val="single" w:color="FFA000" w:sz="4" w:space="1"/>
+        </w:pBdr>
+        <w:spacing w:after="120" w:before="240"/>
+      </w:pPr>
+      <w:r>
+        <w:rPr>
+          <w:rFonts w:ascii="Arial" w:cs="Arial" w:eastAsia="Arial" w:hAnsi="Arial"/>
+          <w:b/>
+          <w:bCs/>
+          <w:color w:val="3949AB"/>
+          <w:sz w:val="24"/>
+          <w:szCs w:val="24"/>
+        </w:rPr>
+        <w:t xml:space="preserve">Tu segunda plantilla, con otra aplicación instalada</w:t>
+      </w:r>
+    </w:p>
+    <w:p>
+      <w:pPr>
+        <w:spacing w:after="100"/>
+      </w:pPr>
+      <w:r>
+        <w:rPr>
+          <w:rFonts w:ascii="Arial" w:cs="Arial" w:eastAsia="Arial" w:hAnsi="Arial"/>
+          <w:color w:val="212121"/>
+          <w:sz w:val="22"/>
+          <w:szCs w:val="22"/>
+        </w:rPr>
+        <w:t xml:space="preserve">Repite el proceso completo del Paso 1 al Paso 3 (instancia → AMI propia → plantilla de lanzamiento) con una aplicación distinta a tu elección — un WordPress, un blog estático distinto, un servicio propio tuyo... lo que quieras, siempre que no sea el panel de reservas.</w:t>
+      </w:r>
+    </w:p>
+    <w:tbl>
+      <w:tblPr>
+        <w:tblW w:type="dxa" w:w="9638"/>
+        <w:tblBorders>
+          <w:top w:val="single" w:color="auto" w:sz="4"/>
+          <w:left w:val="single" w:color="auto" w:sz="4"/>
+          <w:bottom w:val="single" w:color="auto" w:sz="4"/>
+          <w:right w:val="single" w:color="auto" w:sz="4"/>
+          <w:insideH w:val="single" w:color="auto" w:sz="4"/>
+          <w:insideV w:val="single" w:color="auto" w:sz="4"/>
+        </w:tblBorders>
+      </w:tblPr>
+      <w:tblGrid>
+        <w:gridCol w:w="9638"/>
+      </w:tblGrid>
+      <w:tr>
+        <w:tc>
+          <w:tcPr>
+            <w:tcW w:type="dxa" w:w="9638"/>
+            <w:tcBorders>
+              <w:top w:val="none" w:color="FFFFFF" w:sz="0"/>
+              <w:left w:val="none" w:color="FFFFFF" w:sz="0"/>
+              <w:bottom w:val="none" w:color="FFFFFF" w:sz="0"/>
+              <w:right w:val="none" w:color="FFFFFF" w:sz="0"/>
+            </w:tcBorders>
+            <w:shd w:fill="3949AB" w:val="clear"/>
+            <w:tcMar>
+              <w:top w:type="dxa" w:w="80"/>
+              <w:left w:type="dxa" w:w="160"/>
+              <w:bottom w:type="dxa" w:w="80"/>
+              <w:right w:type="dxa" w:w="160"/>
+            </w:tcMar>
+          </w:tcPr>
+          <w:p>
+            <w:r>
+              <w:rPr>
+                <w:rFonts w:ascii="Arial" w:cs="Arial" w:eastAsia="Arial" w:hAnsi="Arial"/>
+                <w:b/>
+                <w:bCs/>
+                <w:color w:val="FFFFFF"/>
+                <w:sz w:val="20"/>
+                <w:szCs w:val="20"/>
+              </w:rPr>
+              <w:t xml:space="preserve">📸 Tu aplicación distinta funcionando en el navegador</w:t>
+            </w:r>
+          </w:p>
+        </w:tc>
+      </w:tr>
+      <w:tr>
+        <w:trPr>
+          <w:trHeight w:val="2400"/>
+        </w:trPr>
+        <w:tc>
+          <w:tcPr>
+            <w:tcW w:type="dxa" w:w="9638"/>
+            <w:tcBorders>
+              <w:top w:val="single" w:color="E0E0E0" w:sz="4"/>
+              <w:left w:val="single" w:color="E0E0E0" w:sz="4"/>
+              <w:bottom w:val="single" w:color="E0E0E0" w:sz="4"/>
+              <w:right w:val="single" w:color="E0E0E0" w:sz="4"/>
+            </w:tcBorders>
+            <w:shd w:fill="FAFAFA" w:val="clear"/>
+            <w:tcMar>
+              <w:top w:type="dxa" w:w="80"/>
+              <w:left w:type="dxa" w:w="160"/>
+              <w:bottom w:type="dxa" w:w="80"/>
+              <w:right w:type="dxa" w:w="160"/>
+            </w:tcMar>
+          </w:tcPr>
+          <w:p>
+            <w:pPr>
+              <w:jc w:val="center"/>
+            </w:pPr>
+            <w:r>
+              <w:rPr>
+                <w:rFonts w:ascii="Arial" w:cs="Arial" w:eastAsia="Arial" w:hAnsi="Arial"/>
+                <w:i/>
+                <w:iCs/>
+                <w:color w:val="757575"/>
+                <w:sz w:val="20"/>
+                <w:szCs w:val="20"/>
+              </w:rPr>
+              <w:t xml:space="preserve">[Pega aquí la captura de pantalla]</w:t>
+            </w:r>
+          </w:p>
+        </w:tc>
+      </w:tr>
+    </w:tbl>
+    <w:p>
+      <w:pPr>
+        <w:spacing w:after="120"/>
+      </w:pPr>
+    </w:p>
+    <w:tbl>
+      <w:tblPr>
+        <w:tblW w:type="dxa" w:w="9638"/>
+        <w:tblBorders>
+          <w:top w:val="single" w:color="auto" w:sz="4"/>
+          <w:left w:val="single" w:color="auto" w:sz="4"/>
+          <w:bottom w:val="single" w:color="auto" w:sz="4"/>
+          <w:right w:val="single" w:color="auto" w:sz="4"/>
+          <w:insideH w:val="single" w:color="auto" w:sz="4"/>
+          <w:insideV w:val="single" w:color="auto" w:sz="4"/>
+        </w:tblBorders>
+      </w:tblPr>
+      <w:tblGrid>
+        <w:gridCol w:w="9638"/>
+      </w:tblGrid>
+      <w:tr>
+        <w:tc>
+          <w:tcPr>
+            <w:tcW w:type="dxa" w:w="9638"/>
+            <w:tcBorders>
+              <w:top w:val="none" w:color="FFFFFF" w:sz="0"/>
+              <w:left w:val="none" w:color="FFFFFF" w:sz="0"/>
+              <w:bottom w:val="none" w:color="FFFFFF" w:sz="0"/>
+              <w:right w:val="none" w:color="FFFFFF" w:sz="0"/>
+            </w:tcBorders>
+            <w:shd w:fill="3949AB" w:val="clear"/>
+            <w:tcMar>
+              <w:top w:type="dxa" w:w="80"/>
+              <w:left w:type="dxa" w:w="160"/>
+              <w:bottom w:type="dxa" w:w="80"/>
+              <w:right w:type="dxa" w:w="160"/>
+            </w:tcMar>
+          </w:tcPr>
+          <w:p>
+            <w:r>
+              <w:rPr>
+                <w:rFonts w:ascii="Arial" w:cs="Arial" w:eastAsia="Arial" w:hAnsi="Arial"/>
+                <w:b/>
+                <w:bCs/>
+                <w:color w:val="FFFFFF"/>
+                <w:sz w:val="20"/>
+                <w:szCs w:val="20"/>
+              </w:rPr>
+              <w:t xml:space="preserve">📸 Resumen de tu segunda plantilla de lanzamiento</w:t>
             </w:r>
           </w:p>
         </w:tc>
@@ -894,7 +1202,7 @@
           <w:sz w:val="22"/>
           <w:szCs w:val="22"/>
         </w:rPr>
-        <w:t xml:space="preserve">Coste mensual estimado de mantener la misma carga (instancia sirviendo el catálogo, tráfico moderado) en tres familias distintas.</w:t>
+        <w:t xml:space="preserve">Coste mensual estimado de mantener la misma carga (instancia sirviendo tu aplicación, tráfico moderado) en tres familias distintas.</w:t>
       </w:r>
     </w:p>
     <w:tbl>

</xml_diff>

<commit_message>
Deployed 1896c90 with MkDocs version: 1.6.1
</commit_message>
<xml_diff>
--- a/tema2/plantillas/Actividad_2_3_INU_Plantilla.docx
+++ b/tema2/plantillas/Actividad_2_3_INU_Plantilla.docx
@@ -1123,6 +1123,99 @@
                 <w:szCs w:val="20"/>
               </w:rPr>
               <w:t xml:space="preserve">📸 Resumen de tu segunda plantilla de lanzamiento</w:t>
+            </w:r>
+          </w:p>
+        </w:tc>
+      </w:tr>
+      <w:tr>
+        <w:trPr>
+          <w:trHeight w:val="2400"/>
+        </w:trPr>
+        <w:tc>
+          <w:tcPr>
+            <w:tcW w:type="dxa" w:w="9638"/>
+            <w:tcBorders>
+              <w:top w:val="single" w:color="E0E0E0" w:sz="4"/>
+              <w:left w:val="single" w:color="E0E0E0" w:sz="4"/>
+              <w:bottom w:val="single" w:color="E0E0E0" w:sz="4"/>
+              <w:right w:val="single" w:color="E0E0E0" w:sz="4"/>
+            </w:tcBorders>
+            <w:shd w:fill="FAFAFA" w:val="clear"/>
+            <w:tcMar>
+              <w:top w:type="dxa" w:w="80"/>
+              <w:left w:type="dxa" w:w="160"/>
+              <w:bottom w:type="dxa" w:w="80"/>
+              <w:right w:type="dxa" w:w="160"/>
+            </w:tcMar>
+          </w:tcPr>
+          <w:p>
+            <w:pPr>
+              <w:jc w:val="center"/>
+            </w:pPr>
+            <w:r>
+              <w:rPr>
+                <w:rFonts w:ascii="Arial" w:cs="Arial" w:eastAsia="Arial" w:hAnsi="Arial"/>
+                <w:i/>
+                <w:iCs/>
+                <w:color w:val="757575"/>
+                <w:sz w:val="20"/>
+                <w:szCs w:val="20"/>
+              </w:rPr>
+              <w:t xml:space="preserve">[Pega aquí la captura de pantalla]</w:t>
+            </w:r>
+          </w:p>
+        </w:tc>
+      </w:tr>
+    </w:tbl>
+    <w:p>
+      <w:pPr>
+        <w:spacing w:after="120"/>
+      </w:pPr>
+    </w:p>
+    <w:tbl>
+      <w:tblPr>
+        <w:tblW w:type="dxa" w:w="9638"/>
+        <w:tblBorders>
+          <w:top w:val="single" w:color="auto" w:sz="4"/>
+          <w:left w:val="single" w:color="auto" w:sz="4"/>
+          <w:bottom w:val="single" w:color="auto" w:sz="4"/>
+          <w:right w:val="single" w:color="auto" w:sz="4"/>
+          <w:insideH w:val="single" w:color="auto" w:sz="4"/>
+          <w:insideV w:val="single" w:color="auto" w:sz="4"/>
+        </w:tblBorders>
+      </w:tblPr>
+      <w:tblGrid>
+        <w:gridCol w:w="9638"/>
+      </w:tblGrid>
+      <w:tr>
+        <w:tc>
+          <w:tcPr>
+            <w:tcW w:type="dxa" w:w="9638"/>
+            <w:tcBorders>
+              <w:top w:val="none" w:color="FFFFFF" w:sz="0"/>
+              <w:left w:val="none" w:color="FFFFFF" w:sz="0"/>
+              <w:bottom w:val="none" w:color="FFFFFF" w:sz="0"/>
+              <w:right w:val="none" w:color="FFFFFF" w:sz="0"/>
+            </w:tcBorders>
+            <w:shd w:fill="3949AB" w:val="clear"/>
+            <w:tcMar>
+              <w:top w:type="dxa" w:w="80"/>
+              <w:left w:type="dxa" w:w="160"/>
+              <w:bottom w:type="dxa" w:w="80"/>
+              <w:right w:type="dxa" w:w="160"/>
+            </w:tcMar>
+          </w:tcPr>
+          <w:p>
+            <w:r>
+              <w:rPr>
+                <w:rFonts w:ascii="Arial" w:cs="Arial" w:eastAsia="Arial" w:hAnsi="Arial"/>
+                <w:b/>
+                <w:bCs/>
+                <w:color w:val="FFFFFF"/>
+                <w:sz w:val="20"/>
+                <w:szCs w:val="20"/>
+              </w:rPr>
+              <w:t xml:space="preserve">📸 La instancia lanzada, con su pestaña Detalles mostrando la plantilla de lanzamiento de origen</w:t>
             </w:r>
           </w:p>
         </w:tc>

</xml_diff>